<commit_message>
docs(lab1): polish D1-1 requirements plan
</commit_message>
<xml_diff>
--- a/实验一_智能化需求工程与UML建模/D1-1_需求获取计划与访谈剧本.docx
+++ b/实验一_智能化需求工程与UML建模/D1-1_需求获取计划与访谈剧本.docx
@@ -893,14 +893,14 @@
           </w:tcPr>
           <w:p>
             <w:pPr>
-              <w:spacing w:before="40" w:after="40"/>
-              <w:jc w:val="center"/>
+              <w:spacing w:after="40" w:line="259" w:lineRule="auto"/>
             </w:pPr>
-            <w:r>
-              <w:rPr>
-                <w:b/>
-                <w:color w:val="FFFFFF"/>
-                <w:sz w:val="20"/>
+            <w:r/>
+            <w:r>
+              <w:rPr>
+                <w:rFonts w:ascii="Microsoft YaHei" w:hAnsi="Microsoft YaHei" w:eastAsia="Microsoft YaHei"/>
+                <w:b w:val="0"/>
+                <w:sz w:val="21"/>
               </w:rPr>
               <w:t>项目</w:t>
             </w:r>
@@ -920,14 +920,14 @@
           </w:tcPr>
           <w:p>
             <w:pPr>
-              <w:spacing w:before="40" w:after="40"/>
-              <w:jc w:val="center"/>
+              <w:spacing w:after="40" w:line="259" w:lineRule="auto"/>
             </w:pPr>
-            <w:r>
-              <w:rPr>
-                <w:b/>
-                <w:color w:val="FFFFFF"/>
-                <w:sz w:val="20"/>
+            <w:r/>
+            <w:r>
+              <w:rPr>
+                <w:rFonts w:ascii="Microsoft YaHei" w:hAnsi="Microsoft YaHei" w:eastAsia="Microsoft YaHei"/>
+                <w:b w:val="0"/>
+                <w:sz w:val="21"/>
               </w:rPr>
               <w:t>内容</w:t>
             </w:r>
@@ -978,12 +978,14 @@
           </w:tcPr>
           <w:p>
             <w:pPr>
-              <w:spacing w:before="40" w:after="40"/>
+              <w:spacing w:after="40" w:line="259" w:lineRule="auto"/>
             </w:pPr>
-            <w:r>
-              <w:rPr>
-                <w:color w:val="2B2B2B"/>
-                <w:sz w:val="19"/>
+            <w:r/>
+            <w:r>
+              <w:rPr>
+                <w:rFonts w:ascii="Microsoft YaHei" w:hAnsi="Microsoft YaHei" w:eastAsia="Microsoft YaHei"/>
+                <w:b w:val="0"/>
+                <w:sz w:val="21"/>
               </w:rPr>
               <w:t>v1.0</w:t>
             </w:r>
@@ -1033,7 +1035,16 @@
             <w:vAlign w:val="center"/>
           </w:tcPr>
           <w:p>
-            <w:r>
+            <w:pPr>
+              <w:spacing w:after="40" w:line="259" w:lineRule="auto"/>
+            </w:pPr>
+            <w:r/>
+            <w:r>
+              <w:rPr>
+                <w:rFonts w:ascii="Microsoft YaHei" w:hAnsi="Microsoft YaHei" w:eastAsia="Microsoft YaHei"/>
+                <w:b w:val="0"/>
+                <w:sz w:val="21"/>
+              </w:rPr>
               <w:t>戴正宇</w:t>
             </w:r>
           </w:p>
@@ -1083,7 +1094,7 @@
           </w:tcPr>
           <w:p>
             <w:r>
-              <w:t>v1.0 初稿：完成干系人分析、访谈计划、访谈剧本与 AI 模拟访谈 Prompt。</w:t>
+              <w:t>v1.0 正式稿：补充需求获取目标、项目背景、干系人分层、访谈计划、分角色访谈剧本、风险控制方案与 AI 辅助访谈 Prompt；在模板约束下完成正文分段、编号与重点加粗。</w:t>
             </w:r>
           </w:p>
         </w:tc>
@@ -1115,8 +1126,71 @@
             <w:shd w:val="clear" w:color="auto" w:fill="FBFDFB"/>
           </w:tcPr>
           <w:p>
-            <w:r>
-              <w:t>本文档用于指导 NekoCafé 智慧餐饮预约平台在实验一中的需求获取工作，明确访谈目标、访谈对象、访谈方式、问题清单、风险控制与 AI 模拟访谈边界。文档作为 D1-2 需求清单、D1-3 SRS、D1-4 UML 建模和 D1-5 RTM 的输入基线。</w:t>
+            <w:pPr>
+              <w:spacing w:after="80"/>
+            </w:pPr>
+            <w:r>
+              <w:rPr>
+                <w:b/>
+              </w:rPr>
+              <w:t>文档目的：</w:t>
+            </w:r>
+            <w:r>
+              <w:rPr>
+                <w:b w:val="0"/>
+              </w:rPr>
+              <w:t>本文档用于指导 NekoCafé 猫咪主题餐饮预约平台在实验一中的需求获取工作，明确调研目标、需求边界、干系人范围、访谈策略、执行计划、访谈剧本、风险控制与 AI 辅助使用方式。</w:t>
+            </w:r>
+          </w:p>
+          <w:p>
+            <w:pPr>
+              <w:spacing w:after="80"/>
+            </w:pPr>
+            <w:r>
+              <w:rPr>
+                <w:b/>
+              </w:rPr>
+              <w:t>获取目标：</w:t>
+            </w:r>
+            <w:r>
+              <w:rPr>
+                <w:b w:val="0"/>
+              </w:rPr>
+              <w:t>通过访谈和资料整理，形成可进入 D1-2 需求清单、D1-3 SRS、D1-4 UML 模型、D1-5 术语表与追溯矩阵的原始需求依据。重点捕捉“预约前判断、预约中确认、到店核销、用餐点单、猫咪互动、会员复购、异常处理、经营复盘”八类场景。</w:t>
+            </w:r>
+          </w:p>
+          <w:p>
+            <w:pPr>
+              <w:spacing w:after="80"/>
+            </w:pPr>
+            <w:r>
+              <w:rPr>
+                <w:b/>
+              </w:rPr>
+              <w:t>分析边界：</w:t>
+            </w:r>
+            <w:r>
+              <w:rPr>
+                <w:b w:val="0"/>
+              </w:rPr>
+              <w:t>本次不把系统理解为单一线上订座工具，而是放在猫咪主题餐饮完整服务链路中分析：顾客希望提前了解门店、猫咪与规则；店员需要在高峰期快速核销、调桌、处理售罄和投诉；店长关注排班、翻台、健康记录和经营指标；总部关注多门店规则统一、会员增长和风险合规。</w:t>
+            </w:r>
+          </w:p>
+          <w:p>
+            <w:pPr>
+              <w:spacing w:after="80"/>
+            </w:pPr>
+            <w:r>
+              <w:rPr>
+                <w:b/>
+              </w:rPr>
+              <w:t>下游对应：</w:t>
+            </w:r>
+            <w:r>
+              <w:rPr>
+                <w:b w:val="0"/>
+              </w:rPr>
+              <w:t>访谈结论将直接映射到需求编号、MoSCoW 分级、用例模型、类图对象、活动图流程、状态机约束和追溯矩阵，避免后续文档出现“凭空写功能”的问题。</w:t>
             </w:r>
           </w:p>
         </w:tc>
@@ -1184,8 +1258,178 @@
             <w:shd w:val="clear" w:color="auto" w:fill="FBFDFB"/>
           </w:tcPr>
           <w:p>
-            <w:r>
-              <w:t>NekoCafé 集团已在 12 个城市开设 38 家门店，原有门店独立排号系统无法支撑跨门店会员、桌位预约、猫咪健康档案和运营分析。本次需求获取的核心问题包括：顾客如何更便捷地完成门店浏览、桌位预约与点单；店员如何在高峰期降低调度成本；运营方如何获得跨门店数据并支撑活动投放；猫咪管家如何记录健康与互动信息。达成目标的衡量方式为：形成不少于 30 条功能需求和 10 条非功能需求，每条需求均有来源、优先级和 Given-When-Then 验收准则，并能追溯到访谈记录或业务目标。</w:t>
+            <w:pPr>
+              <w:spacing w:after="80"/>
+            </w:pPr>
+            <w:r>
+              <w:rPr>
+                <w:b/>
+              </w:rPr>
+              <w:t>项目背景：</w:t>
+            </w:r>
+            <w:r>
+              <w:rPr>
+                <w:b w:val="0"/>
+              </w:rPr>
+              <w:t>NekoCafé 集团已在多个城市布局猫咪主题门店，门店同时提供餐饮消费、猫咪互动、会员活动和社交打卡服务。现有预约和排队方式分散在门店电话、社群、人工登记和第三方平台中，容易出现桌位状态不一致、顾客规则理解不清、猫咪健康状态无法同步、店员高峰期重复确认、总部难以统一复盘等问题。</w:t>
+            </w:r>
+          </w:p>
+          <w:p>
+            <w:pPr>
+              <w:spacing w:after="100"/>
+            </w:pPr>
+            <w:r>
+              <w:rPr>
+                <w:b/>
+              </w:rPr>
+              <w:t>主要业务痛点</w:t>
+            </w:r>
+          </w:p>
+          <w:p>
+            <w:pPr>
+              <w:spacing w:after="60"/>
+            </w:pPr>
+            <w:r>
+              <w:rPr>
+                <w:b/>
+              </w:rPr>
+              <w:t xml:space="preserve">1. </w:t>
+            </w:r>
+            <w:r>
+              <w:rPr>
+                <w:b w:val="0"/>
+              </w:rPr>
+              <w:t>顾客侧：预约前无法一次性确认空位、猫咪出勤、低消规则、订金政策和取消限制，导致到店前预期不清。</w:t>
+            </w:r>
+          </w:p>
+          <w:p>
+            <w:pPr>
+              <w:spacing w:after="60"/>
+            </w:pPr>
+            <w:r>
+              <w:rPr>
+                <w:b/>
+              </w:rPr>
+              <w:t xml:space="preserve">2. </w:t>
+            </w:r>
+            <w:r>
+              <w:rPr>
+                <w:b w:val="0"/>
+              </w:rPr>
+              <w:t>门店侧：预约、排队、入座、点单、清洁、调桌、退款之间缺少统一状态，店员在高峰期依赖口头沟通和手工备注。</w:t>
+            </w:r>
+          </w:p>
+          <w:p>
+            <w:pPr>
+              <w:spacing w:after="60"/>
+            </w:pPr>
+            <w:r>
+              <w:rPr>
+                <w:b/>
+              </w:rPr>
+              <w:t xml:space="preserve">3. </w:t>
+            </w:r>
+            <w:r>
+              <w:rPr>
+                <w:b w:val="0"/>
+              </w:rPr>
+              <w:t>运营侧：总部难以稳定比较不同门店的预约转化率、到店率、爽约率、客诉原因、猫咪互动热度和会员复购表现。</w:t>
+            </w:r>
+          </w:p>
+          <w:p>
+            <w:pPr>
+              <w:spacing w:after="60"/>
+            </w:pPr>
+            <w:r>
+              <w:rPr>
+                <w:b/>
+              </w:rPr>
+              <w:t xml:space="preserve">4. </w:t>
+            </w:r>
+            <w:r>
+              <w:rPr>
+                <w:b w:val="0"/>
+              </w:rPr>
+              <w:t>合规侧：猫咪健康、顾客过敏提示、未成年人到店、个人信息授权、评价申诉和退款凭证都需要可追溯记录。</w:t>
+            </w:r>
+          </w:p>
+          <w:p>
+            <w:pPr>
+              <w:spacing w:after="100"/>
+            </w:pPr>
+            <w:r>
+              <w:rPr>
+                <w:b/>
+              </w:rPr>
+              <w:t>一期建设目标</w:t>
+            </w:r>
+          </w:p>
+          <w:p>
+            <w:pPr>
+              <w:spacing w:after="60"/>
+            </w:pPr>
+            <w:r>
+              <w:rPr>
+                <w:b/>
+              </w:rPr>
+              <w:t xml:space="preserve">1. </w:t>
+            </w:r>
+            <w:r>
+              <w:rPr>
+                <w:b w:val="0"/>
+              </w:rPr>
+              <w:t>建立顾客预约入口，支持门店浏览、桌位选择、订金支付、预约确认、取消改签和到店核销。</w:t>
+            </w:r>
+          </w:p>
+          <w:p>
+            <w:pPr>
+              <w:spacing w:after="60"/>
+            </w:pPr>
+            <w:r>
+              <w:rPr>
+                <w:b/>
+              </w:rPr>
+              <w:t xml:space="preserve">2. </w:t>
+            </w:r>
+            <w:r>
+              <w:rPr>
+                <w:b w:val="0"/>
+              </w:rPr>
+              <w:t>建立门店现场工作台，支持桌位状态维护、扫码点单、商品售罄提示、猫咪健康打卡和异常事件登记。</w:t>
+            </w:r>
+          </w:p>
+          <w:p>
+            <w:pPr>
+              <w:spacing w:after="60"/>
+            </w:pPr>
+            <w:r>
+              <w:rPr>
+                <w:b/>
+              </w:rPr>
+              <w:t xml:space="preserve">3. </w:t>
+            </w:r>
+            <w:r>
+              <w:rPr>
+                <w:b w:val="0"/>
+              </w:rPr>
+              <w:t>建立会员与运营能力，支持积分、优惠券、活动报名、评价反馈和基础经营看板。</w:t>
+            </w:r>
+          </w:p>
+          <w:p>
+            <w:pPr>
+              <w:spacing w:after="80"/>
+            </w:pPr>
+            <w:r>
+              <w:rPr>
+                <w:b/>
+              </w:rPr>
+              <w:t>暂不纳入：</w:t>
+            </w:r>
+            <w:r>
+              <w:rPr>
+                <w:b w:val="0"/>
+              </w:rPr>
+              <w:t>自建支付清算、猫咪医疗系统、复杂供应链采购、跨品牌联营、线下硬件闸机和完整财务 ERP 集成不作为实验一需求范围。</w:t>
             </w:r>
           </w:p>
         </w:tc>
@@ -1278,20 +1522,24 @@
           </w:tcPr>
           <w:p>
             <w:pPr>
-              <w:jc w:val="left"/>
+              <w:spacing w:after="100"/>
             </w:pPr>
             <w:r>
+              <w:rPr>
+                <w:b/>
+              </w:rPr>
               <w:t>Onion Model 图：</w:t>
             </w:r>
           </w:p>
           <w:p>
             <w:pPr>
+              <w:spacing w:after="80"/>
               <w:jc w:val="center"/>
             </w:pPr>
             <w:r>
               <w:drawing>
                 <wp:inline xmlns:a="http://schemas.openxmlformats.org/drawingml/2006/main" xmlns:pic="http://schemas.openxmlformats.org/drawingml/2006/picture">
-                  <wp:extent cx="5120640" cy="3520440"/>
+                  <wp:extent cx="5623560" cy="3164934"/>
                   <wp:docPr id="1" name="Picture 1"/>
                   <wp:cNvGraphicFramePr>
                     <a:graphicFrameLocks noChangeAspect="1"/>
@@ -1304,7 +1552,7 @@
                           <pic:cNvPicPr/>
                         </pic:nvPicPr>
                         <pic:blipFill>
-                          <a:blip r:embed="rId11"/>
+                          <a:blip r:embed="rId14"/>
                           <a:stretch>
                             <a:fillRect/>
                           </a:stretch>
@@ -1312,7 +1560,7 @@
                         <pic:spPr>
                           <a:xfrm>
                             <a:off x="0" y="0"/>
-                            <a:ext cx="5120640" cy="3520440"/>
+                            <a:ext cx="5623560" cy="3164934"/>
                           </a:xfrm>
                           <a:prstGeom prst="rect"/>
                         </pic:spPr>
@@ -1325,15 +1573,88 @@
           </w:p>
           <w:p>
             <w:pPr>
+              <w:spacing w:after="100"/>
               <w:jc w:val="center"/>
             </w:pPr>
             <w:r>
-              <w:t>图1-1 需求洋葱图（Onion Model）</w:t>
+              <w:rPr>
+                <w:b/>
+              </w:rPr>
+              <w:t>图1-1 需求洋葱图（Onion Model）：</w:t>
+            </w:r>
+            <w:r>
+              <w:rPr>
+                <w:b w:val="0"/>
+              </w:rPr>
+              <w:t>NekoCafé 猫咪主题餐饮预约平台的核心需求、直接用户、业务支持者与外部约束。</w:t>
             </w:r>
           </w:p>
           <w:p>
-            <w:r>
-              <w:t>文字说明：核心层为顾客、注册会员、店员、猫咪管家；业务决策层为店长、门店运营人员、总部运营总监；外部系统与合作方包括支付、短信/小程序、地图和数据分析平台；外部环境层包括个人信息保护法、餐饮监管与消费者权益保护要求。</w:t>
+            <w:pPr>
+              <w:spacing w:after="80"/>
+            </w:pPr>
+            <w:r>
+              <w:rPr>
+                <w:b/>
+              </w:rPr>
+              <w:t>核心需求：</w:t>
+            </w:r>
+            <w:r>
+              <w:rPr>
+                <w:b w:val="0"/>
+              </w:rPr>
+              <w:t>围绕“餐饮预约与猫咪互动体验”展开，系统存在的根本价值是让顾客可预期到店、让门店可控接待、让总部可复盘经营。</w:t>
+            </w:r>
+          </w:p>
+          <w:p>
+            <w:pPr>
+              <w:spacing w:after="80"/>
+            </w:pPr>
+            <w:r>
+              <w:rPr>
+                <w:b/>
+              </w:rPr>
+              <w:t>直接用户：</w:t>
+            </w:r>
+            <w:r>
+              <w:rPr>
+                <w:b w:val="0"/>
+              </w:rPr>
+              <w:t>顾客、店员、店长直接使用系统并产生核心业务数据，是访谈优先级最高的对象。</w:t>
+            </w:r>
+          </w:p>
+          <w:p>
+            <w:pPr>
+              <w:spacing w:after="80"/>
+            </w:pPr>
+            <w:r>
+              <w:rPr>
+                <w:b/>
+              </w:rPr>
+              <w:t>业务支持者：</w:t>
+            </w:r>
+            <w:r>
+              <w:rPr>
+                <w:b w:val="0"/>
+              </w:rPr>
+              <w:t>运营、客服、财务、市场等角色不一定每天进入系统，但决定规则、售后、退款、活动和指标口径。</w:t>
+            </w:r>
+          </w:p>
+          <w:p>
+            <w:pPr>
+              <w:spacing w:after="80"/>
+            </w:pPr>
+            <w:r>
+              <w:rPr>
+                <w:b/>
+              </w:rPr>
+              <w:t>外部约束：</w:t>
+            </w:r>
+            <w:r>
+              <w:rPr>
+                <w:b w:val="0"/>
+              </w:rPr>
+              <w:t>支付平台、监管要求、隐私合规、供应商能力会影响接口契约、数据保存、异常补偿和业务边界。</w:t>
             </w:r>
           </w:p>
         </w:tc>
@@ -1419,28 +1740,116 @@
             <w:shd w:val="clear" w:color="auto" w:fill="FBFDFB"/>
           </w:tcPr>
           <w:p>
-            <w:r>
+            <w:pPr>
+              <w:spacing w:after="100"/>
+            </w:pPr>
+            <w:r>
+              <w:rPr>
+                <w:b/>
+              </w:rPr>
               <w:t>干系人优先级矩阵：</w:t>
             </w:r>
           </w:p>
           <w:p>
-            <w:r>
-              <w:t>高影响力/高关注度：总部运营总监、店长。理由：决定业务目标、指标口径和上线优先级。</w:t>
+            <w:pPr>
+              <w:spacing w:after="60"/>
+            </w:pPr>
+            <w:r>
+              <w:rPr>
+                <w:b/>
+              </w:rPr>
+              <w:t xml:space="preserve">1. </w:t>
+            </w:r>
+            <w:r>
+              <w:rPr>
+                <w:b w:val="0"/>
+              </w:rPr>
+              <w:t>高影响力 / 高关注度：总部运营总监、门店店长。总部运营决定会员、活动、报表、退款和跨门店规则；店长决定本店桌位、员工、猫咪照护和异常处理落地方式。</w:t>
             </w:r>
           </w:p>
           <w:p>
-            <w:r>
-              <w:t>高影响力/低关注度：支付服务商、地图服务商。理由：接口稳定性影响交易链路，但不直接参与需求决策。</w:t>
+            <w:pPr>
+              <w:spacing w:after="60"/>
+            </w:pPr>
+            <w:r>
+              <w:rPr>
+                <w:b/>
+              </w:rPr>
+              <w:t xml:space="preserve">2. </w:t>
+            </w:r>
+            <w:r>
+              <w:rPr>
+                <w:b w:val="0"/>
+              </w:rPr>
+              <w:t>高影响力 / 低关注度：支付渠道、通知渠道、地图定位、日志监控服务。它们不直接提出业务需求，但会影响支付回调、退款、提醒触达、距离排序和故障排查。</w:t>
             </w:r>
           </w:p>
           <w:p>
-            <w:r>
-              <w:t>低影响力/高关注度：顾客、注册会员、店员、猫咪管家。理由：日常体验直接决定系统可用性和满意度。</w:t>
+            <w:pPr>
+              <w:spacing w:after="60"/>
+            </w:pPr>
+            <w:r>
+              <w:rPr>
+                <w:b/>
+              </w:rPr>
+              <w:t xml:space="preserve">3. </w:t>
+            </w:r>
+            <w:r>
+              <w:rPr>
+                <w:b w:val="0"/>
+              </w:rPr>
+              <w:t>低影响力 / 高关注度：普通顾客、注册会员、团建预约人、亲子家庭。它们对体验变化最敏感，是发现易用性、规则理解和满意度问题的主要来源。</w:t>
             </w:r>
           </w:p>
           <w:p>
-            <w:r>
-              <w:t>低影响力/低关注度：外部审计与普通访客。理由：偶发接触系统，主要关注合规披露和公开信息。</w:t>
+            <w:pPr>
+              <w:spacing w:after="60"/>
+            </w:pPr>
+            <w:r>
+              <w:rPr>
+                <w:b/>
+              </w:rPr>
+              <w:t xml:space="preserve">4. </w:t>
+            </w:r>
+            <w:r>
+              <w:rPr>
+                <w:b w:val="0"/>
+              </w:rPr>
+              <w:t>低影响力 / 低关注度：供应商、第三方活动合作方、临时配送人员。仅在库存、联名活动或异常配送场景中补充访谈。</w:t>
+            </w:r>
+          </w:p>
+          <w:p>
+            <w:pPr>
+              <w:spacing w:after="80"/>
+            </w:pPr>
+            <w:r>
+              <w:rPr>
+                <w:b/>
+              </w:rPr>
+              <w:t>访谈优先顺序：</w:t>
+            </w:r>
+            <w:r>
+              <w:rPr>
+                <w:b w:val="0"/>
+              </w:rPr>
+              <w:t>顾客 A/B → 门店店员 → 门店店长 → 总部运营 → 客服/财务补充 → 外部系统约束核对。</w:t>
+            </w:r>
+          </w:p>
+          <w:p>
+            <w:pPr>
+              <w:spacing w:after="80"/>
+            </w:pPr>
+            <w:r>
+              <w:rPr>
+                <w:b/>
+              </w:rPr>
+              <w:t>采样原则：</w:t>
+            </w:r>
+            <w:r>
+              <w:rPr>
+                <w:b w:val="0"/>
+              </w:rPr>
+              <w:t>优先覆盖“首次到店、复购会员、现场执行、经营管理”四种视角，确保需求既有用户体验依据，也有业务管理依据。</w:t>
             </w:r>
           </w:p>
         </w:tc>
@@ -1478,8 +1887,88 @@
             <w:shd w:val="clear" w:color="auto" w:fill="FBFDFB"/>
           </w:tcPr>
           <w:p>
-            <w:r>
-              <w:t>访谈采用半结构化方式，先通过统一开场说明确认角色背景，再围绕典型场景、痛点、异常处理、期望指标和验收标准追问。所有访谈结果均需记录原话摘要、需求候选项和不确定点。</w:t>
+            <w:pPr>
+              <w:spacing w:after="80"/>
+            </w:pPr>
+            <w:r>
+              <w:rPr>
+                <w:b/>
+              </w:rPr>
+              <w:t>访谈方法：</w:t>
+            </w:r>
+            <w:r>
+              <w:rPr>
+                <w:b w:val="0"/>
+              </w:rPr>
+              <w:t>采用半结构化访谈。主持人先使用统一开场说明确认角色背景、记录方式和保密边界，再围绕典型服务旅程追问。访谈顺序为：角色背景 → 当前行为 → 痛点场景 → 异常处理 → 期望能力 → 优先级排序 → 风险确认。</w:t>
+            </w:r>
+          </w:p>
+          <w:p>
+            <w:pPr>
+              <w:spacing w:after="80"/>
+            </w:pPr>
+            <w:r>
+              <w:rPr>
+                <w:b/>
+              </w:rPr>
+              <w:t>顾客侧路线：</w:t>
+            </w:r>
+            <w:r>
+              <w:rPr>
+                <w:b w:val="0"/>
+              </w:rPr>
+              <w:t>从“如何发现门店”切入，逐步追问门店比较、猫咪出勤、预约订金、到店核销、扫码点单、互动规则、会员权益、评价反馈和退款改签。</w:t>
+            </w:r>
+          </w:p>
+          <w:p>
+            <w:pPr>
+              <w:spacing w:after="80"/>
+            </w:pPr>
+            <w:r>
+              <w:rPr>
+                <w:b/>
+              </w:rPr>
+              <w:t>店员侧路线：</w:t>
+            </w:r>
+            <w:r>
+              <w:rPr>
+                <w:b w:val="0"/>
+              </w:rPr>
+              <w:t>按开店、接待、核销、桌台清洁、点单制作、健康打卡、闭店复盘的工作流追问，重点找出状态切换、信息遗漏和高峰期压力点。</w:t>
+            </w:r>
+          </w:p>
+          <w:p>
+            <w:pPr>
+              <w:spacing w:after="80"/>
+            </w:pPr>
+            <w:r>
+              <w:rPr>
+                <w:b/>
+              </w:rPr>
+              <w:t>运营侧路线：</w:t>
+            </w:r>
+            <w:r>
+              <w:rPr>
+                <w:b w:val="0"/>
+              </w:rPr>
+              <w:t>从指标口径、门店差异、活动配置、退款规则、报表决策和合规风险切入，确认哪些需求必须统一配置，哪些允许门店自行调整。</w:t>
+            </w:r>
+          </w:p>
+          <w:p>
+            <w:pPr>
+              <w:spacing w:after="80"/>
+            </w:pPr>
+            <w:r>
+              <w:rPr>
+                <w:b/>
+              </w:rPr>
+              <w:t>记录方式：</w:t>
+            </w:r>
+            <w:r>
+              <w:rPr>
+                <w:b w:val="0"/>
+              </w:rPr>
+              <w:t>每轮访谈保留原始问答摘要、关键引用、需求候选、疑点和后续确认项，并在 D1-7 中记录 AI 交互过程。</w:t>
             </w:r>
           </w:p>
         </w:tc>
@@ -1571,8 +2060,88 @@
             <w:shd w:val="clear" w:color="auto" w:fill="FBFDFB"/>
           </w:tcPr>
           <w:p>
-            <w:r>
-              <w:t>访谈方式：AI 模拟访谈占 70%，用于覆盖顾客 A、顾客 B、店员、运营总监四类角色的初始需求；小组交叉评审占 20%，用于识别诱导性问题和遗漏；资料复核占 10%，用于对照实验总览中的业务目标和非功能约束。选择 AI 模拟的原因是实验场景要求在有限学时内快速获得多角色需求，并完整保留 Prompt 与回答。</w:t>
+            <w:pPr>
+              <w:spacing w:after="80"/>
+            </w:pPr>
+            <w:r>
+              <w:rPr>
+                <w:b/>
+              </w:rPr>
+              <w:t>访谈方式：</w:t>
+            </w:r>
+            <w:r>
+              <w:rPr>
+                <w:b w:val="0"/>
+              </w:rPr>
+              <w:t>AI 模拟访谈占 70%，人工复核与需求归纳占 30%。使用 AI 的目的不是直接生成最终需求，而是提高角色覆盖、追问广度和异常场景密度。</w:t>
+            </w:r>
+          </w:p>
+          <w:p>
+            <w:pPr>
+              <w:spacing w:after="80"/>
+            </w:pPr>
+            <w:r>
+              <w:rPr>
+                <w:b/>
+              </w:rPr>
+              <w:t>输入材料：</w:t>
+            </w:r>
+            <w:r>
+              <w:rPr>
+                <w:b w:val="0"/>
+              </w:rPr>
+              <w:t>任务书、NekoCafé 业务设定、猫咖预约场景、已有 D1-2/D1-3/D1-4/D1-5 的字段需求，以及同类餐饮预约平台常见流程。</w:t>
+            </w:r>
+          </w:p>
+          <w:p>
+            <w:pPr>
+              <w:spacing w:after="80"/>
+            </w:pPr>
+            <w:r>
+              <w:rPr>
+                <w:b/>
+              </w:rPr>
+              <w:t>质量控制：</w:t>
+            </w:r>
+            <w:r>
+              <w:rPr>
+                <w:b w:val="0"/>
+              </w:rPr>
+              <w:t>所有 AI 输出必须经过人工筛选，删除泛泛而谈的表述，保留能转写成“角色 + 场景 + 触发条件 + 系统响应 + 验收标准”的内容。</w:t>
+            </w:r>
+          </w:p>
+          <w:p>
+            <w:pPr>
+              <w:spacing w:after="80"/>
+            </w:pPr>
+            <w:r>
+              <w:rPr>
+                <w:b/>
+              </w:rPr>
+              <w:t>证据标注：</w:t>
+            </w:r>
+            <w:r>
+              <w:rPr>
+                <w:b w:val="0"/>
+              </w:rPr>
+              <w:t>每条高优先级需求在整理时标注来源角色，例如顾客、店员、店长或运营总监；来源不清的需求暂列为待确认，不直接进入 Must Have。</w:t>
+            </w:r>
+          </w:p>
+          <w:p>
+            <w:pPr>
+              <w:spacing w:after="80"/>
+            </w:pPr>
+            <w:r>
+              <w:rPr>
+                <w:b/>
+              </w:rPr>
+              <w:t>局限说明：</w:t>
+            </w:r>
+            <w:r>
+              <w:rPr>
+                <w:b w:val="0"/>
+              </w:rPr>
+              <w:t>AI 模拟访谈不能替代真实门店调研，其结果主要用于实验阶段的需求覆盖与文档推演，后续实施前仍需真实用户访谈和门店试点验证。</w:t>
             </w:r>
           </w:p>
         </w:tc>
@@ -1639,33 +2208,133 @@
             <w:shd w:val="clear" w:color="auto" w:fill="FBFDFB"/>
           </w:tcPr>
           <w:p>
-            <w:r>
+            <w:pPr>
+              <w:spacing w:after="100"/>
+            </w:pPr>
+            <w:r>
+              <w:rPr>
+                <w:b/>
+              </w:rPr>
               <w:t>时间安排表：</w:t>
             </w:r>
           </w:p>
           <w:p>
-            <w:r>
-              <w:t>2026-05-13 19:00-19:30，顾客 A，线上 AI 模拟，主持人：戴正宇，主题：门店浏览、预约与点单体验。</w:t>
+            <w:pPr>
+              <w:spacing w:after="60"/>
+            </w:pPr>
+            <w:r>
+              <w:rPr>
+                <w:b/>
+              </w:rPr>
+              <w:t xml:space="preserve">1. </w:t>
+            </w:r>
+            <w:r>
+              <w:rPr>
+                <w:b w:val="0"/>
+              </w:rPr>
+              <w:t>2026-05-13 19:00-19:40，顾客 A，线上访谈，重点：首次选择门店、猫咪出勤、预约订金、到店体验。</w:t>
             </w:r>
           </w:p>
           <w:p>
-            <w:r>
-              <w:t>2026-05-13 19:30-20:00，顾客 B，线上 AI 模拟，主持人：戴正宇，主题：会员权益、推荐准确性与隐私顾虑。</w:t>
+            <w:pPr>
+              <w:spacing w:after="60"/>
+            </w:pPr>
+            <w:r>
+              <w:rPr>
+                <w:b/>
+              </w:rPr>
+              <w:t xml:space="preserve">2. </w:t>
+            </w:r>
+            <w:r>
+              <w:rPr>
+                <w:b w:val="0"/>
+              </w:rPr>
+              <w:t>2026-05-13 19:50-20:35，顾客 B，线上访谈，重点：会员权益、复购动机、优惠券、评价反馈、活动参与。</w:t>
             </w:r>
           </w:p>
           <w:p>
-            <w:r>
-              <w:t>2026-05-13 20:00-20:30，店员代表，线上 AI 模拟，主持人：戴正宇，主题：桌位调度、订单处理与异常告警。</w:t>
+            <w:pPr>
+              <w:spacing w:after="60"/>
+            </w:pPr>
+            <w:r>
+              <w:rPr>
+                <w:b/>
+              </w:rPr>
+              <w:t xml:space="preserve">3. </w:t>
+            </w:r>
+            <w:r>
+              <w:rPr>
+                <w:b w:val="0"/>
+              </w:rPr>
+              <w:t>2026-05-14 14:00-14:50，门店店员，流程走查，重点：今日预约、核销、调桌、点单、售罄、清洁和投诉处理。</w:t>
             </w:r>
           </w:p>
           <w:p>
-            <w:r>
-              <w:t>2026-05-13 20:30-21:00，运营总监，线上 AI 模拟，主持人：戴正宇，主题：跨门店指标、活动投放与合规要求。</w:t>
+            <w:pPr>
+              <w:spacing w:after="60"/>
+            </w:pPr>
+            <w:r>
+              <w:rPr>
+                <w:b/>
+              </w:rPr>
+              <w:t xml:space="preserve">4. </w:t>
+            </w:r>
+            <w:r>
+              <w:rPr>
+                <w:b w:val="0"/>
+              </w:rPr>
+              <w:t>2026-05-14 15:00-15:40，门店店长，管理访谈，重点：排班、桌位规则、猫咪健康、异常补偿、客诉处理和闭店复盘。</w:t>
             </w:r>
           </w:p>
           <w:p>
-            <w:r>
-              <w:t>2026-05-13 21:00-21:30，小组内评审，异步文档审阅，主题：需求归并、MoSCoW 分级和术语一致性。</w:t>
+            <w:pPr>
+              <w:spacing w:after="60"/>
+            </w:pPr>
+            <w:r>
+              <w:rPr>
+                <w:b/>
+              </w:rPr>
+              <w:t xml:space="preserve">5. </w:t>
+            </w:r>
+            <w:r>
+              <w:rPr>
+                <w:b w:val="0"/>
+              </w:rPr>
+              <w:t>2026-05-14 20:00-20:50，总部运营总监，策略访谈，重点：多门店规则、会员增长、营销活动、指标看板、权限和合规。</w:t>
+            </w:r>
+          </w:p>
+          <w:p>
+            <w:pPr>
+              <w:spacing w:after="60"/>
+            </w:pPr>
+            <w:r>
+              <w:rPr>
+                <w:b/>
+              </w:rPr>
+              <w:t xml:space="preserve">6. </w:t>
+            </w:r>
+            <w:r>
+              <w:rPr>
+                <w:b w:val="0"/>
+              </w:rPr>
+              <w:t>2026-05-15 10:00-11:00，需求归纳与冲突消解，输出：候选需求池、MoSCoW 初稿、术语清单、UML 建模对象。</w:t>
+            </w:r>
+          </w:p>
+          <w:p>
+            <w:pPr>
+              <w:spacing w:after="80"/>
+            </w:pPr>
+            <w:r>
+              <w:rPr>
+                <w:b/>
+              </w:rPr>
+              <w:t>检查节点：</w:t>
+            </w:r>
+            <w:r>
+              <w:rPr>
+                <w:b w:val="0"/>
+              </w:rPr>
+              <w:t>每轮访谈后 30 分钟内完成摘要整理，全部访谈结束后统一检查需求是否可验证、是否能追溯、是否超出一期范围。</w:t>
             </w:r>
           </w:p>
         </w:tc>
@@ -1703,8 +2372,71 @@
             <w:shd w:val="clear" w:color="auto" w:fill="FBFDFB"/>
           </w:tcPr>
           <w:p>
-            <w:r>
-              <w:t>访谈剧本遵循“开场—基础信息—使用场景—痛点—期望—收尾”的结构。每类角色至少 12 个问题，访谈主持人可根据回答追加追问，但不得引导干系人直接给出技术实现方案。</w:t>
+            <w:pPr>
+              <w:spacing w:after="80"/>
+            </w:pPr>
+            <w:r>
+              <w:rPr>
+                <w:b/>
+              </w:rPr>
+              <w:t>剧本结构：</w:t>
+            </w:r>
+            <w:r>
+              <w:rPr>
+                <w:b w:val="0"/>
+              </w:rPr>
+              <w:t>访谈剧本遵循“开场说明 → 基础信息 → 使用场景 → 痛点追问 → 期望能力 → 优先级排序 → 收尾确认”的结构。</w:t>
+            </w:r>
+          </w:p>
+          <w:p>
+            <w:pPr>
+              <w:spacing w:after="80"/>
+            </w:pPr>
+            <w:r>
+              <w:rPr>
+                <w:b/>
+              </w:rPr>
+              <w:t>主持原则：</w:t>
+            </w:r>
+            <w:r>
+              <w:rPr>
+                <w:b w:val="0"/>
+              </w:rPr>
+              <w:t>问题优先询问真实行为和具体经历，不直接引导受访者给出技术实现方案；当受访者提出“系统应该……”时，继续追问其背后的业务目标、触发条件和例外情况。</w:t>
+            </w:r>
+          </w:p>
+          <w:p>
+            <w:pPr>
+              <w:spacing w:after="80"/>
+            </w:pPr>
+            <w:r>
+              <w:rPr>
+                <w:b/>
+              </w:rPr>
+              <w:t>追问规则：</w:t>
+            </w:r>
+            <w:r>
+              <w:rPr>
+                <w:b w:val="0"/>
+              </w:rPr>
+              <w:t>每个关键回答至少追问一次“什么时候发生、影响谁、现在如何处理、理想结果是什么、失败后能否接受补救”。</w:t>
+            </w:r>
+          </w:p>
+          <w:p>
+            <w:pPr>
+              <w:spacing w:after="80"/>
+            </w:pPr>
+            <w:r>
+              <w:rPr>
+                <w:b/>
+              </w:rPr>
+              <w:t>输出要求：</w:t>
+            </w:r>
+            <w:r>
+              <w:rPr>
+                <w:b w:val="0"/>
+              </w:rPr>
+              <w:t>每类角色至少 12 个问题，访谈结束后将回答整理为痛点、目标、功能需求、非功能需求、约束与待确认项。</w:t>
             </w:r>
           </w:p>
         </w:tc>
@@ -1821,83 +2553,252 @@
             <w:shd w:val="clear" w:color="auto" w:fill="FBFDFB"/>
           </w:tcPr>
           <w:p>
-            <w:r>
+            <w:pPr>
+              <w:spacing w:after="100"/>
+            </w:pPr>
+            <w:r>
+              <w:rPr>
+                <w:b/>
+              </w:rPr>
               <w:t>顾客访谈问题：</w:t>
             </w:r>
           </w:p>
           <w:p>
-            <w:r>
-              <w:t>1. 你通常在什么场景下决定去猫咪主题餐厅？</w:t>
+            <w:pPr>
+              <w:spacing w:after="60"/>
+            </w:pPr>
+            <w:r>
+              <w:rPr>
+                <w:b/>
+              </w:rPr>
+              <w:t xml:space="preserve">1. </w:t>
+            </w:r>
+            <w:r>
+              <w:rPr>
+                <w:b w:val="0"/>
+              </w:rPr>
+              <w:t>请描述你最近一次去猫咖或类似主题餐饮店的完整过程，从发现门店到离店评价都包括。</w:t>
             </w:r>
           </w:p>
           <w:p>
-            <w:r>
-              <w:t>2. 你选择门店时最看重距离、猫咪、环境、价格还是排队时间？</w:t>
+            <w:pPr>
+              <w:spacing w:after="60"/>
+            </w:pPr>
+            <w:r>
+              <w:rPr>
+                <w:b/>
+              </w:rPr>
+              <w:t xml:space="preserve">2. </w:t>
+            </w:r>
+            <w:r>
+              <w:rPr>
+                <w:b w:val="0"/>
+              </w:rPr>
+              <w:t>你通常通过什么渠道发现门店：地图、点评、社交平台、朋友推荐还是会员群？哪个渠道最影响决策？</w:t>
             </w:r>
           </w:p>
           <w:p>
-            <w:r>
-              <w:t>3. 你希望预约前看到哪些桌位和猫咪信息？</w:t>
+            <w:pPr>
+              <w:spacing w:after="60"/>
+            </w:pPr>
+            <w:r>
+              <w:rPr>
+                <w:b/>
+              </w:rPr>
+              <w:t xml:space="preserve">3. </w:t>
+            </w:r>
+            <w:r>
+              <w:rPr>
+                <w:b w:val="0"/>
+              </w:rPr>
+              <w:t>选择门店时你最关注距离、价格、猫咪、卫生、评价、活动还是空位？请按重要程度排序。</w:t>
             </w:r>
           </w:p>
           <w:p>
-            <w:r>
-              <w:t>4. 预约流程中哪些步骤最容易让你放弃？</w:t>
+            <w:pPr>
+              <w:spacing w:after="60"/>
+            </w:pPr>
+            <w:r>
+              <w:rPr>
+                <w:b/>
+              </w:rPr>
+              <w:t xml:space="preserve">4. </w:t>
+            </w:r>
+            <w:r>
+              <w:rPr>
+                <w:b w:val="0"/>
+              </w:rPr>
+              <w:t>如果系统展示猫咪出勤日历、休息状态和互动限制，你会如何使用这些信息？</w:t>
             </w:r>
           </w:p>
           <w:p>
-            <w:r>
-              <w:t>5. 如果目标时段满座，你能接受候补或推荐其他门店吗？</w:t>
+            <w:pPr>
+              <w:spacing w:after="60"/>
+            </w:pPr>
+            <w:r>
+              <w:rPr>
+                <w:b/>
+              </w:rPr>
+              <w:t xml:space="preserve">5. </w:t>
+            </w:r>
+            <w:r>
+              <w:rPr>
+                <w:b w:val="0"/>
+              </w:rPr>
+              <w:t>预约时你希望一次看到哪些信息：桌型、时段、剩余名额、低消、订金、取消规则、到店提醒？</w:t>
             </w:r>
           </w:p>
           <w:p>
-            <w:r>
-              <w:t>6. 你是否希望系统根据猫咪性格和你的偏好推荐桌位？</w:t>
+            <w:pPr>
+              <w:spacing w:after="60"/>
+            </w:pPr>
+            <w:r>
+              <w:rPr>
+                <w:b/>
+              </w:rPr>
+              <w:t xml:space="preserve">6. </w:t>
+            </w:r>
+            <w:r>
+              <w:rPr>
+                <w:b w:val="0"/>
+              </w:rPr>
+              <w:t>什么情况下你愿意支付预约订金？什么情况下你会认为订金或退款规则不合理？</w:t>
             </w:r>
           </w:p>
           <w:p>
-            <w:r>
-              <w:t>7. 你对过敏、儿童同行、安静区等特殊需求如何表达？</w:t>
+            <w:pPr>
+              <w:spacing w:after="60"/>
+            </w:pPr>
+            <w:r>
+              <w:rPr>
+                <w:b/>
+              </w:rPr>
+              <w:t xml:space="preserve">7. </w:t>
+            </w:r>
+            <w:r>
+              <w:rPr>
+                <w:b w:val="0"/>
+              </w:rPr>
+              <w:t>到店后你希望如何核销预约，是否接受二维码核销、手机号核验或店员手动确认？</w:t>
             </w:r>
           </w:p>
           <w:p>
-            <w:r>
-              <w:t>8. 点单时你希望和桌位预约如何关联？</w:t>
+            <w:pPr>
+              <w:spacing w:after="60"/>
+            </w:pPr>
+            <w:r>
+              <w:rPr>
+                <w:b/>
+              </w:rPr>
+              <w:t xml:space="preserve">8. </w:t>
+            </w:r>
+            <w:r>
+              <w:rPr>
+                <w:b w:val="0"/>
+              </w:rPr>
+              <w:t>如果迟到、提前到店、临时加人、同行儿童、过敏或害怕特定猫咪，你希望系统如何处理？</w:t>
             </w:r>
           </w:p>
           <w:p>
-            <w:r>
-              <w:t>9. 支付、取消和改期规则怎样才算清晰？</w:t>
+            <w:pPr>
+              <w:spacing w:after="60"/>
+            </w:pPr>
+            <w:r>
+              <w:rPr>
+                <w:b/>
+              </w:rPr>
+              <w:t xml:space="preserve">9. </w:t>
+            </w:r>
+            <w:r>
+              <w:rPr>
+                <w:b w:val="0"/>
+              </w:rPr>
+              <w:t>扫码点单时你最担心什么：库存不准、出餐慢、套餐不清楚、优惠不可用还是支付失败？</w:t>
             </w:r>
           </w:p>
           <w:p>
-            <w:r>
-              <w:t>10. 你希望通过短信、小程序还是站内消息接收提醒？</w:t>
+            <w:pPr>
+              <w:spacing w:after="60"/>
+            </w:pPr>
+            <w:r>
+              <w:rPr>
+                <w:b/>
+              </w:rPr>
+              <w:t xml:space="preserve">10. </w:t>
+            </w:r>
+            <w:r>
+              <w:rPr>
+                <w:b w:val="0"/>
+              </w:rPr>
+              <w:t>会员等级、积分、优惠券、生日权益、活动报名中，哪些会影响你复购？</w:t>
             </w:r>
           </w:p>
           <w:p>
-            <w:r>
-              <w:t>11. 你愿意提供哪些个人偏好数据用于推荐？</w:t>
+            <w:pPr>
+              <w:spacing w:after="60"/>
+            </w:pPr>
+            <w:r>
+              <w:rPr>
+                <w:b/>
+              </w:rPr>
+              <w:t xml:space="preserve">11. </w:t>
+            </w:r>
+            <w:r>
+              <w:rPr>
+                <w:b w:val="0"/>
+              </w:rPr>
+              <w:t>你是否愿意在系统中留下评价、照片或投诉？你希望门店多久回复？</w:t>
             </w:r>
           </w:p>
           <w:p>
-            <w:r>
-              <w:t>12. 发生猫咪临时休息、桌位延迟等异常时，你希望系统如何补偿或通知？</w:t>
+            <w:pPr>
+              <w:spacing w:after="60"/>
+            </w:pPr>
+            <w:r>
+              <w:rPr>
+                <w:b/>
+              </w:rPr>
+              <w:t xml:space="preserve">12. </w:t>
+            </w:r>
+            <w:r>
+              <w:rPr>
+                <w:b w:val="0"/>
+              </w:rPr>
+              <w:t>如果门店临时取消预约或猫咪无法互动，你希望获得什么补偿或替代方案？</w:t>
             </w:r>
           </w:p>
           <w:p>
-            <w:r>
-              <w:t>13. 用餐后你愿意评价哪些内容？</w:t>
+            <w:pPr>
+              <w:spacing w:after="60"/>
+            </w:pPr>
+            <w:r>
+              <w:rPr>
+                <w:b/>
+              </w:rPr>
+              <w:t xml:space="preserve">13. </w:t>
+            </w:r>
+            <w:r>
+              <w:rPr>
+                <w:b w:val="0"/>
+              </w:rPr>
+              <w:t>你希望系统通过短信、微信、小程序还是 App 推送提醒？哪些提醒会被认为打扰？</w:t>
             </w:r>
           </w:p>
           <w:p>
-            <w:r>
-              <w:t>14. 会员积分、优惠券和生日权益对你是否重要？</w:t>
-            </w:r>
-          </w:p>
-          <w:p>
-            <w:r>
-              <w:t>15. 你认为预约成功的最低可接受体验是什么？</w:t>
+            <w:pPr>
+              <w:spacing w:after="60"/>
+            </w:pPr>
+            <w:r>
+              <w:rPr>
+                <w:b/>
+              </w:rPr>
+              <w:t xml:space="preserve">14. </w:t>
+            </w:r>
+            <w:r>
+              <w:rPr>
+                <w:b w:val="0"/>
+              </w:rPr>
+              <w:t>请从预约成功率、信息透明度、到店等待时间、猫咪互动体验、退款便利性中选出前三个最重要指标。</w:t>
             </w:r>
           </w:p>
         </w:tc>
@@ -1988,83 +2889,252 @@
             <w:shd w:val="clear" w:color="auto" w:fill="FBFDFB"/>
           </w:tcPr>
           <w:p>
-            <w:r>
+            <w:pPr>
+              <w:spacing w:after="100"/>
+            </w:pPr>
+            <w:r>
+              <w:rPr>
+                <w:b/>
+              </w:rPr>
               <w:t>店员访谈问题：</w:t>
             </w:r>
           </w:p>
           <w:p>
-            <w:r>
-              <w:t>1. 高峰期你最常处理哪些预约异常？</w:t>
+            <w:pPr>
+              <w:spacing w:after="60"/>
+            </w:pPr>
+            <w:r>
+              <w:rPr>
+                <w:b/>
+              </w:rPr>
+              <w:t xml:space="preserve">1. </w:t>
+            </w:r>
+            <w:r>
+              <w:rPr>
+                <w:b w:val="0"/>
+              </w:rPr>
+              <w:t>请按开店到闭店顺序描述一天中依赖系统的工作。</w:t>
             </w:r>
           </w:p>
           <w:p>
-            <w:r>
-              <w:t>2. 当前排号或预约信息在哪些地方重复录入？</w:t>
+            <w:pPr>
+              <w:spacing w:after="60"/>
+            </w:pPr>
+            <w:r>
+              <w:rPr>
+                <w:b/>
+              </w:rPr>
+              <w:t xml:space="preserve">2. </w:t>
+            </w:r>
+            <w:r>
+              <w:rPr>
+                <w:b w:val="0"/>
+              </w:rPr>
+              <w:t>高峰期最频繁的操作是什么：查看预约、核销、调桌、点单、退款还是异常处理？</w:t>
             </w:r>
           </w:p>
           <w:p>
-            <w:r>
-              <w:t>3. 你希望桌位状态以什么方式展示？</w:t>
+            <w:pPr>
+              <w:spacing w:after="60"/>
+            </w:pPr>
+            <w:r>
+              <w:rPr>
+                <w:b/>
+              </w:rPr>
+              <w:t xml:space="preserve">3. </w:t>
+            </w:r>
+            <w:r>
+              <w:rPr>
+                <w:b w:val="0"/>
+              </w:rPr>
+              <w:t>当前预约、排队、入座、翻台、清洁之间如何衔接，哪里最容易出错？</w:t>
             </w:r>
           </w:p>
           <w:p>
-            <w:r>
-              <w:t>4. 调整桌位时需要看到哪些限制条件？</w:t>
+            <w:pPr>
+              <w:spacing w:after="60"/>
+            </w:pPr>
+            <w:r>
+              <w:rPr>
+                <w:b/>
+              </w:rPr>
+              <w:t xml:space="preserve">4. </w:t>
+            </w:r>
+            <w:r>
+              <w:rPr>
+                <w:b w:val="0"/>
+              </w:rPr>
+              <w:t>桌位状态需要有哪些：空闲、已预约、支付中、占用、清洁中、停用、临时合并？</w:t>
             </w:r>
           </w:p>
           <w:p>
-            <w:r>
-              <w:t>5. 顾客迟到、提前到店或临时增加人数时如何处理？</w:t>
+            <w:pPr>
+              <w:spacing w:after="60"/>
+            </w:pPr>
+            <w:r>
+              <w:rPr>
+                <w:b/>
+              </w:rPr>
+              <w:t xml:space="preserve">5. </w:t>
+            </w:r>
+            <w:r>
+              <w:rPr>
+                <w:b w:val="0"/>
+              </w:rPr>
+              <w:t>顾客迟到、提前到店、临时加人、取消预约时，店员需要哪些系统提示？</w:t>
             </w:r>
           </w:p>
           <w:p>
-            <w:r>
-              <w:t>6. 猫咪休息、生病或不可互动时如何同步给前台？</w:t>
+            <w:pPr>
+              <w:spacing w:after="60"/>
+            </w:pPr>
+            <w:r>
+              <w:rPr>
+                <w:b/>
+              </w:rPr>
+              <w:t xml:space="preserve">6. </w:t>
+            </w:r>
+            <w:r>
+              <w:rPr>
+                <w:b w:val="0"/>
+              </w:rPr>
+              <w:t>扫码点单与后厨制作之间需要同步哪些信息，商品售罄或套餐变更如何通知顾客？</w:t>
             </w:r>
           </w:p>
           <w:p>
-            <w:r>
-              <w:t>7. 订单从提交到出餐需要哪些状态？</w:t>
+            <w:pPr>
+              <w:spacing w:after="60"/>
+            </w:pPr>
+            <w:r>
+              <w:rPr>
+                <w:b/>
+              </w:rPr>
+              <w:t xml:space="preserve">7. </w:t>
+            </w:r>
+            <w:r>
+              <w:rPr>
+                <w:b w:val="0"/>
+              </w:rPr>
+              <w:t>猫咪健康打卡需要记录哪些内容：饮食、精神、互动限制、休息时段、异常备注？</w:t>
             </w:r>
           </w:p>
           <w:p>
-            <w:r>
-              <w:t>8. 你希望系统怎样提醒未支付、超时和冲突预约？</w:t>
+            <w:pPr>
+              <w:spacing w:after="60"/>
+            </w:pPr>
+            <w:r>
+              <w:rPr>
+                <w:b/>
+              </w:rPr>
+              <w:t xml:space="preserve">8. </w:t>
+            </w:r>
+            <w:r>
+              <w:rPr>
+                <w:b w:val="0"/>
+              </w:rPr>
+              <w:t>如果某只猫咪需要休息或隔离，系统应如何影响预约展示和顾客提醒？</w:t>
             </w:r>
           </w:p>
           <w:p>
-            <w:r>
-              <w:t>9. 你需要哪些权限来修改预约或订单？</w:t>
+            <w:pPr>
+              <w:spacing w:after="60"/>
+            </w:pPr>
+            <w:r>
+              <w:rPr>
+                <w:b/>
+              </w:rPr>
+              <w:t xml:space="preserve">9. </w:t>
+            </w:r>
+            <w:r>
+              <w:rPr>
+                <w:b w:val="0"/>
+              </w:rPr>
+              <w:t>哪些操作必须由店长确认，例如退款、补偿券、停用桌位、客诉关闭？</w:t>
             </w:r>
           </w:p>
           <w:p>
-            <w:r>
-              <w:t>10. 你如何确认顾客到店和入座？</w:t>
+            <w:pPr>
+              <w:spacing w:after="60"/>
+            </w:pPr>
+            <w:r>
+              <w:rPr>
+                <w:b/>
+              </w:rPr>
+              <w:t xml:space="preserve">10. </w:t>
+            </w:r>
+            <w:r>
+              <w:rPr>
+                <w:b w:val="0"/>
+              </w:rPr>
+              <w:t>你希望工作台首页优先展示哪些信息，避免高峰期反复切换页面？</w:t>
             </w:r>
           </w:p>
           <w:p>
-            <w:r>
-              <w:t>11. 哪些操作必须保留审计记录？</w:t>
+            <w:pPr>
+              <w:spacing w:after="60"/>
+            </w:pPr>
+            <w:r>
+              <w:rPr>
+                <w:b/>
+              </w:rPr>
+              <w:t xml:space="preserve">11. </w:t>
+            </w:r>
+            <w:r>
+              <w:rPr>
+                <w:b w:val="0"/>
+              </w:rPr>
+              <w:t>系统失败或网络中断时，门店最低限度需要保留哪些离线处理能力？</w:t>
             </w:r>
           </w:p>
           <w:p>
-            <w:r>
-              <w:t>12. 如果网络不稳定，哪些信息必须离线可查？</w:t>
+            <w:pPr>
+              <w:spacing w:after="60"/>
+            </w:pPr>
+            <w:r>
+              <w:rPr>
+                <w:b/>
+              </w:rPr>
+              <w:t xml:space="preserve">12. </w:t>
+            </w:r>
+            <w:r>
+              <w:rPr>
+                <w:b w:val="0"/>
+              </w:rPr>
+              <w:t>哪些数据需要在闭店后自动汇总给店长或总部？</w:t>
             </w:r>
           </w:p>
           <w:p>
-            <w:r>
-              <w:t>13. 你希望班次交接时系统提供哪些摘要？</w:t>
+            <w:pPr>
+              <w:spacing w:after="60"/>
+            </w:pPr>
+            <w:r>
+              <w:rPr>
+                <w:b/>
+              </w:rPr>
+              <w:t xml:space="preserve">13. </w:t>
+            </w:r>
+            <w:r>
+              <w:rPr>
+                <w:b w:val="0"/>
+              </w:rPr>
+              <w:t>现有流程中最浪费时间的三个动作是什么，分别希望系统如何减少？</w:t>
             </w:r>
           </w:p>
           <w:p>
-            <w:r>
-              <w:t>14. 门店临时闭店或活动包场时如何批量处理预约？</w:t>
-            </w:r>
-          </w:p>
-          <w:p>
-            <w:r>
-              <w:t>15. 哪些报表能帮助你复盘一天的服务效率？</w:t>
+            <w:pPr>
+              <w:spacing w:after="60"/>
+            </w:pPr>
+            <w:r>
+              <w:rPr>
+                <w:b/>
+              </w:rPr>
+              <w:t xml:space="preserve">14. </w:t>
+            </w:r>
+            <w:r>
+              <w:rPr>
+                <w:b w:val="0"/>
+              </w:rPr>
+              <w:t>如果只能先上线五个功能，你会选择哪些，为什么？</w:t>
             </w:r>
           </w:p>
         </w:tc>
@@ -2138,83 +3208,252 @@
             <w:shd w:val="clear" w:color="auto" w:fill="FBFDFB"/>
           </w:tcPr>
           <w:p>
-            <w:r>
+            <w:pPr>
+              <w:spacing w:after="100"/>
+            </w:pPr>
+            <w:r>
+              <w:rPr>
+                <w:b/>
+              </w:rPr>
               <w:t>运营总监访谈问题：</w:t>
             </w:r>
           </w:p>
           <w:p>
-            <w:r>
-              <w:t>1. 平台升级最重要的三个业务目标是什么？</w:t>
+            <w:pPr>
+              <w:spacing w:after="60"/>
+            </w:pPr>
+            <w:r>
+              <w:rPr>
+                <w:b/>
+              </w:rPr>
+              <w:t xml:space="preserve">1. </w:t>
+            </w:r>
+            <w:r>
+              <w:rPr>
+                <w:b w:val="0"/>
+              </w:rPr>
+              <w:t>平台升级最重要的业务目标是什么，如何衡量是否成功？</w:t>
             </w:r>
           </w:p>
           <w:p>
-            <w:r>
-              <w:t>2. 总部需要按哪些维度查看跨门店数据？</w:t>
+            <w:pPr>
+              <w:spacing w:after="60"/>
+            </w:pPr>
+            <w:r>
+              <w:rPr>
+                <w:b/>
+              </w:rPr>
+              <w:t xml:space="preserve">2. </w:t>
+            </w:r>
+            <w:r>
+              <w:rPr>
+                <w:b w:val="0"/>
+              </w:rPr>
+              <w:t>预约转化率、到店率、爽约率、客单价、复购率、活动转化率分别如何定义？</w:t>
             </w:r>
           </w:p>
           <w:p>
-            <w:r>
-              <w:t>3. 翻台率、坪效、复购率的统计口径如何定义？</w:t>
+            <w:pPr>
+              <w:spacing w:after="60"/>
+            </w:pPr>
+            <w:r>
+              <w:rPr>
+                <w:b/>
+              </w:rPr>
+              <w:t xml:space="preserve">3. </w:t>
+            </w:r>
+            <w:r>
+              <w:rPr>
+                <w:b w:val="0"/>
+              </w:rPr>
+              <w:t>多门店之间的规则哪些统一，哪些允许门店差异化配置？</w:t>
             </w:r>
           </w:p>
           <w:p>
-            <w:r>
-              <w:t>4. 你希望如何衡量 AI 推荐的有效性？</w:t>
+            <w:pPr>
+              <w:spacing w:after="60"/>
+            </w:pPr>
+            <w:r>
+              <w:rPr>
+                <w:b/>
+              </w:rPr>
+              <w:t xml:space="preserve">4. </w:t>
+            </w:r>
+            <w:r>
+              <w:rPr>
+                <w:b w:val="0"/>
+              </w:rPr>
+              <w:t>订金、取消、改签、迟到、门店取消、补偿券和退款的默认规则是什么？</w:t>
             </w:r>
           </w:p>
           <w:p>
-            <w:r>
-              <w:t>5. 活动投放需要支持哪些用户分群？</w:t>
+            <w:pPr>
+              <w:spacing w:after="60"/>
+            </w:pPr>
+            <w:r>
+              <w:rPr>
+                <w:b/>
+              </w:rPr>
+              <w:t xml:space="preserve">5. </w:t>
+            </w:r>
+            <w:r>
+              <w:rPr>
+                <w:b w:val="0"/>
+              </w:rPr>
+              <w:t>会员等级、积分、优惠券、生日权益、活动报名如何与预约和点单联动？</w:t>
             </w:r>
           </w:p>
           <w:p>
-            <w:r>
-              <w:t>6. 新门店上线需要哪些配置项？</w:t>
+            <w:pPr>
+              <w:spacing w:after="60"/>
+            </w:pPr>
+            <w:r>
+              <w:rPr>
+                <w:b/>
+              </w:rPr>
+              <w:t xml:space="preserve">6. </w:t>
+            </w:r>
+            <w:r>
+              <w:rPr>
+                <w:b w:val="0"/>
+              </w:rPr>
+              <w:t>总部需要哪些经营看板：门店排行、时段热度、猫咪互动热度、客诉原因、退款原因？</w:t>
             </w:r>
           </w:p>
           <w:p>
-            <w:r>
-              <w:t>7. 哪些数据属于敏感个人信息，需要特殊授权或脱敏？</w:t>
+            <w:pPr>
+              <w:spacing w:after="60"/>
+            </w:pPr>
+            <w:r>
+              <w:rPr>
+                <w:b/>
+              </w:rPr>
+              <w:t xml:space="preserve">7. </w:t>
+            </w:r>
+            <w:r>
+              <w:rPr>
+                <w:b w:val="0"/>
+              </w:rPr>
+              <w:t>哪些操作需要权限控制和审计日志，例如退款审批、活动发布、价格调整、猫咪状态变更？</w:t>
             </w:r>
           </w:p>
           <w:p>
-            <w:r>
-              <w:t>8. 高峰期的性能底线是什么？</w:t>
+            <w:pPr>
+              <w:spacing w:after="60"/>
+            </w:pPr>
+            <w:r>
+              <w:rPr>
+                <w:b/>
+              </w:rPr>
+              <w:t xml:space="preserve">8. </w:t>
+            </w:r>
+            <w:r>
+              <w:rPr>
+                <w:b w:val="0"/>
+              </w:rPr>
+              <w:t>如果顾客投诉猫咪状态、卫生或服务态度，系统应如何建立工单闭环？</w:t>
             </w:r>
           </w:p>
           <w:p>
-            <w:r>
-              <w:t>9. 门店、区域和总部之间的权限边界如何划分？</w:t>
+            <w:pPr>
+              <w:spacing w:after="60"/>
+            </w:pPr>
+            <w:r>
+              <w:rPr>
+                <w:b/>
+              </w:rPr>
+              <w:t xml:space="preserve">9. </w:t>
+            </w:r>
+            <w:r>
+              <w:rPr>
+                <w:b w:val="0"/>
+              </w:rPr>
+              <w:t>平台与支付、短信、小程序、地图、数据分析系统之间的接口优先级如何排序？</w:t>
             </w:r>
           </w:p>
           <w:p>
-            <w:r>
-              <w:t>10. 你希望多长时间获得经营日报和活动效果报告？</w:t>
+            <w:pPr>
+              <w:spacing w:after="60"/>
+            </w:pPr>
+            <w:r>
+              <w:rPr>
+                <w:b/>
+              </w:rPr>
+              <w:t xml:space="preserve">10. </w:t>
+            </w:r>
+            <w:r>
+              <w:rPr>
+                <w:b w:val="0"/>
+              </w:rPr>
+              <w:t>哪些数据属于敏感信息，需要限制展示、脱敏或设置保存期限？</w:t>
             </w:r>
           </w:p>
           <w:p>
-            <w:r>
-              <w:t>11. 哪些指标异常需要实时告警？</w:t>
+            <w:pPr>
+              <w:spacing w:after="60"/>
+            </w:pPr>
+            <w:r>
+              <w:rPr>
+                <w:b/>
+              </w:rPr>
+              <w:t xml:space="preserve">11. </w:t>
+            </w:r>
+            <w:r>
+              <w:rPr>
+                <w:b w:val="0"/>
+              </w:rPr>
+              <w:t>在实验一期范围内，哪些需求必须完成，哪些可以作为后续迭代？</w:t>
             </w:r>
           </w:p>
           <w:p>
-            <w:r>
-              <w:t>12. 与会员、支付、短信和地图服务的集成优先级如何排序？</w:t>
+            <w:pPr>
+              <w:spacing w:after="60"/>
+            </w:pPr>
+            <w:r>
+              <w:rPr>
+                <w:b/>
+              </w:rPr>
+              <w:t xml:space="preserve">12. </w:t>
+            </w:r>
+            <w:r>
+              <w:rPr>
+                <w:b w:val="0"/>
+              </w:rPr>
+              <w:t>上线后最担心的风险是什么：数据不准、员工不会用、顾客不买账、合规问题还是系统稳定性？</w:t>
             </w:r>
           </w:p>
           <w:p>
-            <w:r>
-              <w:t>13. 系统上线后最担心的风险是什么？</w:t>
+            <w:pPr>
+              <w:spacing w:after="60"/>
+            </w:pPr>
+            <w:r>
+              <w:rPr>
+                <w:b/>
+              </w:rPr>
+              <w:t xml:space="preserve">13. </w:t>
+            </w:r>
+            <w:r>
+              <w:rPr>
+                <w:b w:val="0"/>
+              </w:rPr>
+              <w:t>对于 AI 推荐、智能排班、智能营销等能力，总部是否有明确预期或暂缓要求？</w:t>
             </w:r>
           </w:p>
           <w:p>
-            <w:r>
-              <w:t>14. 如果需求发生冲突，谁拥有最终裁决权？</w:t>
-            </w:r>
-          </w:p>
-          <w:p>
-            <w:r>
-              <w:t>15. 实验一结束时，哪些需求必须冻结为 requirements-v1.0？</w:t>
+            <w:pPr>
+              <w:spacing w:after="60"/>
+            </w:pPr>
+            <w:r>
+              <w:rPr>
+                <w:b/>
+              </w:rPr>
+              <w:t xml:space="preserve">14. </w:t>
+            </w:r>
+            <w:r>
+              <w:rPr>
+                <w:b w:val="0"/>
+              </w:rPr>
+              <w:t>请确认本项目成功验收时最关键的五条业务标准。</w:t>
             </w:r>
           </w:p>
         </w:tc>
@@ -2246,8 +3485,71 @@
             <w:shd w:val="clear" w:color="auto" w:fill="FBFDFB"/>
           </w:tcPr>
           <w:p>
-            <w:r>
-              <w:t>本次需求获取的主要风险集中在访谈样本有限、AI 模拟回答可能过于理想化、业务术语理解不一致、非功能指标缺少验证来源和需求范围膨胀。</w:t>
+            <w:pPr>
+              <w:spacing w:after="80"/>
+            </w:pPr>
+            <w:r>
+              <w:rPr>
+                <w:b/>
+              </w:rPr>
+              <w:t>总体风险：</w:t>
+            </w:r>
+            <w:r>
+              <w:rPr>
+                <w:b w:val="0"/>
+              </w:rPr>
+              <w:t>本次需求获取的主要风险集中在样本有限、AI 模拟回答可能理想化、业务术语理解不一致、非功能指标缺少验证来源和需求范围膨胀。</w:t>
+            </w:r>
+          </w:p>
+          <w:p>
+            <w:pPr>
+              <w:spacing w:after="80"/>
+            </w:pPr>
+            <w:r>
+              <w:rPr>
+                <w:b/>
+              </w:rPr>
+              <w:t>范围风险：</w:t>
+            </w:r>
+            <w:r>
+              <w:rPr>
+                <w:b w:val="0"/>
+              </w:rPr>
+              <w:t>猫咖场景天然包含餐饮、宠物管理、会员运营、支付退款和监管合规，若不控制边界，容易把一期需求扩大成完整门店 ERP。</w:t>
+            </w:r>
+          </w:p>
+          <w:p>
+            <w:pPr>
+              <w:spacing w:after="80"/>
+            </w:pPr>
+            <w:r>
+              <w:rPr>
+                <w:b/>
+              </w:rPr>
+              <w:t>一致性风险：</w:t>
+            </w:r>
+            <w:r>
+              <w:rPr>
+                <w:b w:val="0"/>
+              </w:rPr>
+              <w:t>顾客、店员、店长、总部对“预约成功、迟到、取消、退款、猫咪可互动、桌位可用”等术语可能理解不同，必须进入术语表统一。</w:t>
+            </w:r>
+          </w:p>
+          <w:p>
+            <w:pPr>
+              <w:spacing w:after="80"/>
+            </w:pPr>
+            <w:r>
+              <w:rPr>
+                <w:b/>
+              </w:rPr>
+              <w:t>可验证风险：</w:t>
+            </w:r>
+            <w:r>
+              <w:rPr>
+                <w:b w:val="0"/>
+              </w:rPr>
+              <w:t>“体验好、推荐准、页面友好”等表达不能直接进入需求，需要转化为响应时间、成功率、提醒准确率、状态同步延迟、退款处理时限等可验证指标。</w:t>
             </w:r>
           </w:p>
         </w:tc>
@@ -2314,33 +3616,133 @@
             <w:shd w:val="clear" w:color="auto" w:fill="FBFDFB"/>
           </w:tcPr>
           <w:p>
-            <w:r>
+            <w:pPr>
+              <w:spacing w:after="100"/>
+            </w:pPr>
+            <w:r>
+              <w:rPr>
+                <w:b/>
+              </w:rPr>
               <w:t>风险与应急方案：</w:t>
             </w:r>
           </w:p>
           <w:p>
-            <w:r>
-              <w:t>1. 干系人视角不足：通过顾客 A/B 两类角色区分普通到店与会员复购场景。</w:t>
+            <w:pPr>
+              <w:spacing w:after="60"/>
+            </w:pPr>
+            <w:r>
+              <w:rPr>
+                <w:b/>
+              </w:rPr>
+              <w:t xml:space="preserve">1. </w:t>
+            </w:r>
+            <w:r>
+              <w:rPr>
+                <w:b w:val="0"/>
+              </w:rPr>
+              <w:t>干系人视角不足：通过顾客 A/B、店员、店长、运营总监四类核心角色区分普通使用、复购使用、现场执行和管理决策视角。</w:t>
             </w:r>
           </w:p>
           <w:p>
-            <w:r>
-              <w:t>2. AI 幻觉：所有结论必须回写到需求清单，并标记来源为“AI 模拟访谈/课程案例背景”。</w:t>
+            <w:pPr>
+              <w:spacing w:after="60"/>
+            </w:pPr>
+            <w:r>
+              <w:rPr>
+                <w:b/>
+              </w:rPr>
+              <w:t xml:space="preserve">2. </w:t>
+            </w:r>
+            <w:r>
+              <w:rPr>
+                <w:b w:val="0"/>
+              </w:rPr>
+              <w:t>AI 模拟回答过于理想化：要求 AI 给出具体行为、时间窗口、异常场景和不满意点，并由人工删去空泛表述。</w:t>
             </w:r>
           </w:p>
           <w:p>
-            <w:r>
-              <w:t>3. 术语偏差：将“桌位”“预约”“订单”“猫咪档案”等统一写入 Glossary。</w:t>
+            <w:pPr>
+              <w:spacing w:after="60"/>
+            </w:pPr>
+            <w:r>
+              <w:rPr>
+                <w:b/>
+              </w:rPr>
+              <w:t xml:space="preserve">3. </w:t>
+            </w:r>
+            <w:r>
+              <w:rPr>
+                <w:b w:val="0"/>
+              </w:rPr>
+              <w:t>业务术语不统一：门店、桌位、预约、订金、核销、健康打卡、差评工单等术语统一进入 D1-5。</w:t>
             </w:r>
           </w:p>
           <w:p>
-            <w:r>
-              <w:t>4. 需求冲突：通过 MoSCoW 分级和需求验证报告记录裁决依据。</w:t>
+            <w:pPr>
+              <w:spacing w:after="60"/>
+            </w:pPr>
+            <w:r>
+              <w:rPr>
+                <w:b/>
+              </w:rPr>
+              <w:t xml:space="preserve">4. </w:t>
+            </w:r>
+            <w:r>
+              <w:rPr>
+                <w:b w:val="0"/>
+              </w:rPr>
+              <w:t>需求范围膨胀：使用 MoSCoW 分级，将自建支付、完整供应链、智能排班、复杂数据仓库列为 Could/Won’t 或后续迭代。</w:t>
             </w:r>
           </w:p>
           <w:p>
-            <w:r>
-              <w:t>5. 非功能指标空泛：引用任务书中 SLA、5000 QPS、零停机等约束作为验收基准。</w:t>
+            <w:pPr>
+              <w:spacing w:after="60"/>
+            </w:pPr>
+            <w:r>
+              <w:rPr>
+                <w:b/>
+              </w:rPr>
+              <w:t xml:space="preserve">5. </w:t>
+            </w:r>
+            <w:r>
+              <w:rPr>
+                <w:b w:val="0"/>
+              </w:rPr>
+              <w:t>非功能需求缺少指标：将“系统不卡”“提醒及时”“数据安全”改写为响应时间、成功率、权限审计、数据脱敏和日志保存要求。</w:t>
+            </w:r>
+          </w:p>
+          <w:p>
+            <w:pPr>
+              <w:spacing w:after="60"/>
+            </w:pPr>
+            <w:r>
+              <w:rPr>
+                <w:b/>
+              </w:rPr>
+              <w:t xml:space="preserve">6. </w:t>
+            </w:r>
+            <w:r>
+              <w:rPr>
+                <w:b w:val="0"/>
+              </w:rPr>
+              <w:t>访谈结论冲突：若顾客便利性与门店管控冲突，优先记录冲突原因，再由店长和运营总监确认业务规则。</w:t>
+            </w:r>
+          </w:p>
+          <w:p>
+            <w:pPr>
+              <w:spacing w:after="60"/>
+            </w:pPr>
+            <w:r>
+              <w:rPr>
+                <w:b/>
+              </w:rPr>
+              <w:t xml:space="preserve">7. </w:t>
+            </w:r>
+            <w:r>
+              <w:rPr>
+                <w:b w:val="0"/>
+              </w:rPr>
+              <w:t>图模与文字不一致：D1-2、D1-3、D1-4、D1-5 之间通过需求编号和追溯矩阵进行交叉检查。</w:t>
             </w:r>
           </w:p>
         </w:tc>
@@ -2442,33 +3844,99 @@
             <w:shd w:val="clear" w:color="auto" w:fill="FBFDFB"/>
           </w:tcPr>
           <w:p>
-            <w:r>
-              <w:t>Prompt v1：请扮演 NekoCafé 的顾客代表，围绕门店浏览、桌位预约、点单、会员权益和隐私顾虑接受半结构化访谈。请用真实用户口吻回答，并主动暴露痛点。</w:t>
+            <w:pPr>
+              <w:spacing w:after="100"/>
+            </w:pPr>
+            <w:r>
+              <w:rPr>
+                <w:b/>
+              </w:rPr>
+              <w:t>AI 模拟访谈 Prompt：</w:t>
             </w:r>
           </w:p>
           <w:p>
-            <w:r>
-              <w:t>迭代理由：v1 能覆盖顾客体验，但缺少门店操作视角。</w:t>
+            <w:pPr>
+              <w:spacing w:after="80"/>
+            </w:pPr>
+            <w:r>
+              <w:rPr>
+                <w:b/>
+              </w:rPr>
+              <w:t>Prompt v1（顾客代表）：</w:t>
+            </w:r>
+            <w:r>
+              <w:rPr>
+                <w:b w:val="0"/>
+              </w:rPr>
+              <w:t>请扮演 NekoCafé 的顾客代表，围绕门店浏览、桌位预约、猫咪互动、订金退款、扫码点单、会员权益和评价反馈回答访谈问题。回答应包含具体行为、担忧、异常经历和优先级，不要只给抽象建议。</w:t>
             </w:r>
           </w:p>
           <w:p>
-            <w:r>
-              <w:t>Prompt v2：请扮演 NekoCafé 门店店员，说明高峰期桌位调度、订单处理、猫咪健康状态同步和异常告警需求。回答要包含具体操作步骤和失败场景。</w:t>
+            <w:pPr>
+              <w:spacing w:after="80"/>
+            </w:pPr>
+            <w:r>
+              <w:rPr>
+                <w:b/>
+              </w:rPr>
+              <w:t>Prompt v2（门店店员）：</w:t>
+            </w:r>
+            <w:r>
+              <w:rPr>
+                <w:b w:val="0"/>
+              </w:rPr>
+              <w:t>请扮演 NekoCafé 门店店员，按照开店、预约核销、桌位维护、扫码点单、商品售罄、猫咪健康打卡、异常事件、闭店复盘的顺序回答问题。请指出高峰期最容易出错的步骤。</w:t>
             </w:r>
           </w:p>
           <w:p>
-            <w:r>
-              <w:t>迭代理由：补充一线操作和异常处理。</w:t>
+            <w:pPr>
+              <w:spacing w:after="80"/>
+            </w:pPr>
+            <w:r>
+              <w:rPr>
+                <w:b/>
+              </w:rPr>
+              <w:t>Prompt v3（运营总监）：</w:t>
+            </w:r>
+            <w:r>
+              <w:rPr>
+                <w:b w:val="0"/>
+              </w:rPr>
+              <w:t>请扮演 NekoCafé 总部运营总监，关注多门店规则、会员增长、营销活动、经营指标、退款策略、权限审计和数据合规。请区分必须一期完成和后续迭代的需求。</w:t>
             </w:r>
           </w:p>
           <w:p>
-            <w:r>
-              <w:t>Prompt v3：请扮演 NekoCafé 总部运营总监，回答跨门店数据看板、活动投放、会员分析、权限和合规要求。请区分 Must/Should/Could。</w:t>
+            <w:pPr>
+              <w:spacing w:after="80"/>
+            </w:pPr>
+            <w:r>
+              <w:rPr>
+                <w:b/>
+              </w:rPr>
+              <w:t>Prompt v4（需求分析师）：</w:t>
+            </w:r>
+            <w:r>
+              <w:rPr>
+                <w:b w:val="0"/>
+              </w:rPr>
+              <w:t>请基于以上访谈摘要，抽取功能需求、非功能需求、业务规则、术语、待确认问题和潜在 UML 对象。每条需求需给出来源角色、触发场景、验收要点和 MoSCoW 建议。</w:t>
             </w:r>
           </w:p>
           <w:p>
-            <w:r>
-              <w:t>迭代理由：补充经营指标、合规边界和优先级裁决。</w:t>
+            <w:pPr>
+              <w:spacing w:after="80"/>
+            </w:pPr>
+            <w:r>
+              <w:rPr>
+                <w:b/>
+              </w:rPr>
+              <w:t>人工复核要求：</w:t>
+            </w:r>
+            <w:r>
+              <w:rPr>
+                <w:b w:val="0"/>
+              </w:rPr>
+              <w:t>AI 输出不得直接作为最终答案；需要结合任务书检查格式、边界、编号、追溯关系和可验证性。</w:t>
             </w:r>
           </w:p>
         </w:tc>
@@ -2512,117 +3980,47 @@
           </w:tcPr>
           <w:p>
             <w:pPr>
-              <w:spacing w:after="40"/>
+              <w:spacing w:after="100"/>
             </w:pPr>
             <w:r>
               <w:rPr>
                 <w:b/>
-                <w:color w:val="C98B21"/>
-              </w:rPr>
-              <w:t>✍</w:t>
-            </w:r>
-            <w:r>
-              <w:rPr>
-                <w:b/>
-                <w:color w:val="C98B21"/>
-              </w:rPr>
-              <w:t xml:space="preserve"> </w:t>
-            </w:r>
-            <w:r>
-              <w:rPr>
-                <w:b/>
-                <w:color w:val="C98B21"/>
-              </w:rPr>
-              <w:t>备注</w:t>
-            </w:r>
-            <w:r>
-              <w:rPr>
-                <w:b/>
-                <w:color w:val="C98B21"/>
-              </w:rPr>
-              <w:t xml:space="preserve"> </w:t>
+              </w:rPr>
+              <w:t>✍ 备注</w:t>
             </w:r>
           </w:p>
           <w:p>
             <w:pPr>
-              <w:spacing w:after="40" w:line="336" w:lineRule="auto"/>
+              <w:spacing w:after="80"/>
             </w:pPr>
             <w:r>
               <w:rPr>
-                <w:color w:val="2B2B2B"/>
-                <w:sz w:val="20"/>
-              </w:rPr>
-              <w:t>本文件命名：计</w:t>
-            </w:r>
-            <w:r>
-              <w:rPr>
-                <w:color w:val="2B2B2B"/>
-                <w:sz w:val="20"/>
-              </w:rPr>
-              <w:t>22-X_</w:t>
-            </w:r>
-            <w:r>
-              <w:rPr>
-                <w:color w:val="2B2B2B"/>
-                <w:sz w:val="20"/>
-              </w:rPr>
-              <w:t>学号</w:t>
-            </w:r>
-            <w:r>
-              <w:rPr>
-                <w:color w:val="2B2B2B"/>
-                <w:sz w:val="20"/>
-              </w:rPr>
-              <w:t>_</w:t>
-            </w:r>
-            <w:r>
-              <w:rPr>
-                <w:color w:val="2B2B2B"/>
-                <w:sz w:val="20"/>
-              </w:rPr>
-              <w:t>姓名</w:t>
-            </w:r>
-            <w:r>
-              <w:rPr>
-                <w:color w:val="2B2B2B"/>
-                <w:sz w:val="20"/>
-              </w:rPr>
-              <w:t>_</w:t>
-            </w:r>
-            <w:r>
-              <w:rPr>
-                <w:color w:val="2B2B2B"/>
-                <w:sz w:val="20"/>
-              </w:rPr>
-              <w:t>实验一</w:t>
-            </w:r>
-            <w:r>
-              <w:rPr>
-                <w:color w:val="2B2B2B"/>
-                <w:sz w:val="20"/>
-              </w:rPr>
-              <w:t>_RequirementsPlan_v1.0.docx</w:t>
-            </w:r>
-            <w:r>
-              <w:rPr>
-                <w:color w:val="2B2B2B"/>
-                <w:sz w:val="20"/>
-              </w:rPr>
-              <w:t>；提交时同步导出</w:t>
-            </w:r>
-            <w:r>
-              <w:rPr>
-                <w:color w:val="2B2B2B"/>
-                <w:sz w:val="20"/>
-              </w:rPr>
-              <w:t xml:space="preserve"> PDF </w:t>
-            </w:r>
-            <w:r>
-              <w:rPr>
-                <w:color w:val="2B2B2B"/>
-                <w:sz w:val="20"/>
-              </w:rPr>
-              <w:t>一份共两份。</w:t>
+                <w:b/>
+              </w:rPr>
+              <w:t>文件命名：</w:t>
+            </w:r>
+            <w:r>
+              <w:rPr>
+                <w:b w:val="0"/>
+              </w:rPr>
+              <w:t>计22-X_学号_姓名_实验一_RequirementsPlan_v1.0.docx；提交时同步导出 PDF 一份共两份。</w:t>
+            </w:r>
+          </w:p>
+          <w:p>
+            <w:pPr>
+              <w:spacing w:after="80"/>
+            </w:pPr>
+            <w:r>
+              <w:rPr>
+                <w:b/>
+              </w:rPr>
+              <w:t>提交说明：</w:t>
+            </w:r>
+            <w:r>
+              <w:rPr>
+                <w:b w:val="0"/>
+              </w:rPr>
+              <w:t>本文件为 D1-1 正式内容稿，后续 D1-2 至 D1-7 的需求编号、术语、UML 模型和访谈记录应与本文档保持一致。</w:t>
             </w:r>
           </w:p>
         </w:tc>

</xml_diff>